<commit_message>
Allow 5s video tributes and sync UI copy
Lowers the minimum tribute video length from 20s to 5s while keeping the 120s max, and centralizes the limits via shared constants in media validation. Updates form/list helper text and validation errors to use the same values so user-facing guidance stays consistent with actual enforcement. Also updates the student greeting guide document.
</commit_message>
<xml_diff>
--- a/Student_Greeting_Guide.docx
+++ b/Student_Greeting_Guide.docx
@@ -1014,7 +1014,7 @@
           <w:sz w:val="22"/>
           <w:szCs w:val="22"/>
         </w:rPr>
-        <w:t xml:space="preserve">Attach Photo or Video (Optional) — You can attach a photo (JPG, PNG, WEBP) or a short video (MP4 or WEBM). Maximum file size: 50 MB. Videos must be between 20 seconds and 2 minutes long.</w:t>
+        <w:t xml:space="preserve">Attach Photo or Video (Optional) — You can attach a photo (JPG, PNG, WEBP) or a short video (MP4 or WEBM). Maximum file size: 50 MB. Videos must be between 5 seconds and 2 minutes long.</w:t>
       </w:r>
     </w:p>
     <w:p>
@@ -1625,7 +1625,7 @@
                 <w:sz w:val="20"/>
                 <w:szCs w:val="20"/>
               </w:rPr>
-              <w:t xml:space="preserve">20 sec – 2 min</w:t>
+              <w:t xml:space="preserve">5 sec – 2 min</w:t>
             </w:r>
           </w:p>
         </w:tc>
@@ -1934,7 +1934,7 @@
           <w:sz w:val="22"/>
           <w:szCs w:val="22"/>
         </w:rPr>
-        <w:t xml:space="preserve">A: Videos on the teacher's timeline must be between 20 seconds and 2 minutes long. Very short clips (under 20 seconds) or long videos (over 2 minutes) will not be accepted.</w:t>
+        <w:t xml:space="preserve">A: Videos on the teacher's timeline must be between 5 seconds and 2 minutes long. Very short clips (under 5 seconds) or long videos (over 2 minutes) will not be accepted.</w:t>
       </w:r>
     </w:p>
     <w:p>

</xml_diff>